<commit_message>
doc: voeg echte data screenshots toe aan pitch
</commit_message>
<xml_diff>
--- a/doc/Digidokters_App_Pitch.docx
+++ b/doc/Digidokters_App_Pitch.docx
@@ -86,35 +86,7 @@
     </w:p>
     <w:p>
       <w:pPr>
-        <w:pStyle w:val="ListBullet"/>
-      </w:pPr>
-      <w:r>
-        <w:rPr>
-          <w:b/>
-        </w:rPr>
-        <w:t xml:space="preserve">Overzichtelijke Agenda &amp; Planning: </w:t>
-      </w:r>
-      <w:r>
-        <w:t>Plan eenvoudig eenmalige of wekelijks terugkerende sessies. Vrijwilligers zien in één oogopslag waar en wanneer ze verwacht worden.</w:t>
-      </w:r>
-    </w:p>
-    <w:p>
-      <w:pPr>
-        <w:pStyle w:val="ListBullet"/>
-      </w:pPr>
-      <w:r>
-        <w:rPr>
-          <w:b/>
-        </w:rPr>
-        <w:t xml:space="preserve">Documenten- &amp; Handleidingenbeheer: </w:t>
-      </w:r>
-      <w:r>
-        <w:t>Een gedeelde mappenstructuur waarin digidokters handleidingen, stappenplannen of handige links met elkaar kunnen delen.</w:t>
-      </w:r>
-    </w:p>
-    <w:p>
-      <w:pPr>
-        <w:spacing w:before="200"/>
+        <w:spacing w:before="100"/>
       </w:pPr>
     </w:p>
     <w:p>
@@ -124,7 +96,7 @@
       <w:r>
         <w:drawing>
           <wp:inline xmlns:a="http://schemas.openxmlformats.org/drawingml/2006/main" xmlns:pic="http://schemas.openxmlformats.org/drawingml/2006/picture">
-            <wp:extent cx="5029200" cy="2867176"/>
+            <wp:extent cx="4754880" cy="2710785"/>
             <wp:docPr id="1" name="Picture 1"/>
             <wp:cNvGraphicFramePr>
               <a:graphicFrameLocks noChangeAspect="1"/>
@@ -133,7 +105,7 @@
               <a:graphicData uri="http://schemas.openxmlformats.org/drawingml/2006/picture">
                 <pic:pic>
                   <pic:nvPicPr>
-                    <pic:cNvPr id="0" name="screenshot_1.png"/>
+                    <pic:cNvPr id="0" name="screenshot_registratie_form.png"/>
                     <pic:cNvPicPr/>
                   </pic:nvPicPr>
                   <pic:blipFill>
@@ -145,7 +117,7 @@
                   <pic:spPr>
                     <a:xfrm>
                       <a:off x="0" y="0"/>
-                      <a:ext cx="5029200" cy="2867176"/>
+                      <a:ext cx="4754880" cy="2710785"/>
                     </a:xfrm>
                     <a:prstGeom prst="rect"/>
                   </pic:spPr>
@@ -165,7 +137,77 @@
           <w:i/>
           <w:sz w:val="18"/>
         </w:rPr>
-        <w:t>Figuur 1: Eenvoudig en overzichtelijk beheer binnen de applicatie.</w:t>
+        <w:t>Figuur 1: Het eenvoudige formulier voor bezoekersregistratie.</w:t>
+      </w:r>
+    </w:p>
+    <w:p>
+      <w:pPr>
+        <w:pStyle w:val="ListBullet"/>
+      </w:pPr>
+      <w:r>
+        <w:rPr>
+          <w:b/>
+        </w:rPr>
+        <w:t xml:space="preserve">Realtime Registratielijst: </w:t>
+      </w:r>
+      <w:r>
+        <w:t>Een direct overzicht van alle geregistreerde vragen. Dit helpt bij het makkelijk zoeken naar cliënten of eerdere registraties en biedt direct inzicht in de dagelijkse werking.</w:t>
+      </w:r>
+    </w:p>
+    <w:p>
+      <w:pPr>
+        <w:spacing w:before="100"/>
+      </w:pPr>
+    </w:p>
+    <w:p>
+      <w:pPr>
+        <w:jc w:val="center"/>
+      </w:pPr>
+      <w:r>
+        <w:drawing>
+          <wp:inline xmlns:a="http://schemas.openxmlformats.org/drawingml/2006/main" xmlns:pic="http://schemas.openxmlformats.org/drawingml/2006/picture">
+            <wp:extent cx="4754880" cy="2710785"/>
+            <wp:docPr id="2" name="Picture 2"/>
+            <wp:cNvGraphicFramePr>
+              <a:graphicFrameLocks noChangeAspect="1"/>
+            </wp:cNvGraphicFramePr>
+            <a:graphic>
+              <a:graphicData uri="http://schemas.openxmlformats.org/drawingml/2006/picture">
+                <pic:pic>
+                  <pic:nvPicPr>
+                    <pic:cNvPr id="0" name="screenshot_registraties_lijst.png"/>
+                    <pic:cNvPicPr/>
+                  </pic:nvPicPr>
+                  <pic:blipFill>
+                    <a:blip r:embed="rId10"/>
+                    <a:stretch>
+                      <a:fillRect/>
+                    </a:stretch>
+                  </pic:blipFill>
+                  <pic:spPr>
+                    <a:xfrm>
+                      <a:off x="0" y="0"/>
+                      <a:ext cx="4754880" cy="2710785"/>
+                    </a:xfrm>
+                    <a:prstGeom prst="rect"/>
+                  </pic:spPr>
+                </pic:pic>
+              </a:graphicData>
+            </a:graphic>
+          </wp:inline>
+        </w:drawing>
+      </w:r>
+    </w:p>
+    <w:p>
+      <w:pPr>
+        <w:jc w:val="center"/>
+      </w:pPr>
+      <w:r>
+        <w:rPr>
+          <w:i/>
+          <w:sz w:val="18"/>
+        </w:rPr>
+        <w:t>Figuur 2: Het realtime overzicht van alle registraties binnen de organisatie.</w:t>
       </w:r>
     </w:p>
     <w:p>
@@ -176,7 +218,79 @@
         <w:rPr>
           <w:color w:val="1B365D"/>
         </w:rPr>
-        <w:t>3. Directe Grafieken en Realtime Statistieken</w:t>
+        <w:t>3. Overzichtelijke Agenda &amp; Planning</w:t>
+      </w:r>
+    </w:p>
+    <w:p>
+      <w:r>
+        <w:t>Plan eenvoudig eenmalige of wekelijks terugkerende sessies (zoals een digicafé of opleiding). Vrijwilligers zien in één oogopslag waar en wanneer ze verwacht worden, welke locaties actief zijn en wie er nog meer aanwezig is.</w:t>
+      </w:r>
+    </w:p>
+    <w:p>
+      <w:pPr>
+        <w:spacing w:before="100"/>
+      </w:pPr>
+    </w:p>
+    <w:p>
+      <w:pPr>
+        <w:jc w:val="center"/>
+      </w:pPr>
+      <w:r>
+        <w:drawing>
+          <wp:inline xmlns:a="http://schemas.openxmlformats.org/drawingml/2006/main" xmlns:pic="http://schemas.openxmlformats.org/drawingml/2006/picture">
+            <wp:extent cx="4754880" cy="2710785"/>
+            <wp:docPr id="3" name="Picture 3"/>
+            <wp:cNvGraphicFramePr>
+              <a:graphicFrameLocks noChangeAspect="1"/>
+            </wp:cNvGraphicFramePr>
+            <a:graphic>
+              <a:graphicData uri="http://schemas.openxmlformats.org/drawingml/2006/picture">
+                <pic:pic>
+                  <pic:nvPicPr>
+                    <pic:cNvPr id="0" name="screenshot_agenda.png"/>
+                    <pic:cNvPicPr/>
+                  </pic:nvPicPr>
+                  <pic:blipFill>
+                    <a:blip r:embed="rId11"/>
+                    <a:stretch>
+                      <a:fillRect/>
+                    </a:stretch>
+                  </pic:blipFill>
+                  <pic:spPr>
+                    <a:xfrm>
+                      <a:off x="0" y="0"/>
+                      <a:ext cx="4754880" cy="2710785"/>
+                    </a:xfrm>
+                    <a:prstGeom prst="rect"/>
+                  </pic:spPr>
+                </pic:pic>
+              </a:graphicData>
+            </a:graphic>
+          </wp:inline>
+        </w:drawing>
+      </w:r>
+    </w:p>
+    <w:p>
+      <w:pPr>
+        <w:jc w:val="center"/>
+      </w:pPr>
+      <w:r>
+        <w:rPr>
+          <w:i/>
+          <w:sz w:val="18"/>
+        </w:rPr>
+        <w:t>Figuur 3: De overzichtelijke agenda met locaties en aanwezige digidokters.</w:t>
+      </w:r>
+    </w:p>
+    <w:p>
+      <w:pPr>
+        <w:pStyle w:val="Heading1"/>
+      </w:pPr>
+      <w:r>
+        <w:rPr>
+          <w:color w:val="1B365D"/>
+        </w:rPr>
+        <w:t>4. Directe Grafieken en Realtime Statistieken</w:t>
       </w:r>
     </w:p>
     <w:p>
@@ -228,7 +342,7 @@
     </w:p>
     <w:p>
       <w:pPr>
-        <w:spacing w:before="200"/>
+        <w:spacing w:before="100"/>
       </w:pPr>
     </w:p>
     <w:p>
@@ -238,8 +352,8 @@
       <w:r>
         <w:drawing>
           <wp:inline xmlns:a="http://schemas.openxmlformats.org/drawingml/2006/main" xmlns:pic="http://schemas.openxmlformats.org/drawingml/2006/picture">
-            <wp:extent cx="5029200" cy="2867176"/>
-            <wp:docPr id="2" name="Picture 2"/>
+            <wp:extent cx="4754880" cy="2710785"/>
+            <wp:docPr id="4" name="Picture 4"/>
             <wp:cNvGraphicFramePr>
               <a:graphicFrameLocks noChangeAspect="1"/>
             </wp:cNvGraphicFramePr>
@@ -247,11 +361,11 @@
               <a:graphicData uri="http://schemas.openxmlformats.org/drawingml/2006/picture">
                 <pic:pic>
                   <pic:nvPicPr>
-                    <pic:cNvPr id="0" name="screenshot_2.png"/>
+                    <pic:cNvPr id="0" name="screenshot_statistieken.png"/>
                     <pic:cNvPicPr/>
                   </pic:nvPicPr>
                   <pic:blipFill>
-                    <a:blip r:embed="rId10"/>
+                    <a:blip r:embed="rId12"/>
                     <a:stretch>
                       <a:fillRect/>
                     </a:stretch>
@@ -259,7 +373,7 @@
                   <pic:spPr>
                     <a:xfrm>
                       <a:off x="0" y="0"/>
-                      <a:ext cx="5029200" cy="2867176"/>
+                      <a:ext cx="4754880" cy="2710785"/>
                     </a:xfrm>
                     <a:prstGeom prst="rect"/>
                   </pic:spPr>
@@ -279,7 +393,7 @@
           <w:i/>
           <w:sz w:val="18"/>
         </w:rPr>
-        <w:t>Figuur 2: Realtime dashboards en log-overzichten voor coördinatoren.</w:t>
+        <w:t>Figuur 4: Het realtime statistiekendashboard met trends en grafieken.</w:t>
       </w:r>
     </w:p>
     <w:p>
@@ -290,7 +404,7 @@
         <w:rPr>
           <w:color w:val="1B365D"/>
         </w:rPr>
-        <w:t>4. Privacy &amp; Veiligheid (GDPR/AVG Proof)</w:t>
+        <w:t>5. Privacy &amp; Veiligheid (GDPR/AVG Proof)</w:t>
       </w:r>
     </w:p>
     <w:p>
@@ -351,7 +465,7 @@
         <w:t xml:space="preserve">Gecontroleerde Beveiliging: </w:t>
       </w:r>
       <w:r>
-        <w:t>De applicatie is recent onderworpen aan een uitgebreide security audit. Alle beveiligingsrisico's (zoals onbevoegde toegang, dataverwijdering of script-misbruik) zijn volledig opgelost en dichtgezet.</w:t>
+        <w:t>De applicatie is recent onderworpen aan een uitgebreide security audit. Alle beveiligingsrisico's zijn volledig opgelost en dichtgezet.</w:t>
       </w:r>
     </w:p>
     <w:p>
@@ -362,7 +476,7 @@
         <w:rPr>
           <w:color w:val="1B365D"/>
         </w:rPr>
-        <w:t>5. Waarom overstappen op dit platform?</w:t>
+        <w:t>6. Waarom overstappen op dit platform?</w:t>
       </w:r>
     </w:p>
     <w:p>

</xml_diff>